<commit_message>
Updates to final draft on 9/11/2026
</commit_message>
<xml_diff>
--- a/SEASUG_42-2026_Grasby_Berleant_Gingras.docx
+++ b/SEASUG_42-2026_Grasby_Berleant_Gingras.docx
@@ -256,7 +256,13 @@
         <w:t xml:space="preserve"> every aspect of modern society. Commonly recognized as the “world’s largest machine”</w:t>
       </w:r>
       <w:r>
-        <w:t xml:space="preserve"> [1], the North American Bulk Electric System (BES) is one of the most important systems to the lives of virtually every resident of the United States, Canada, and a portion of Mexico. Organized energy markets, which use the BES to transmit electricity, are constructs that allow </w:t>
+        <w:t xml:space="preserve"> [1], the North American Bulk Electric System (BES) is one of the most important systems to the lives of virtually every resident of the United States, Canada, and a portion of Mexico. Organized </w:t>
+      </w:r>
+      <w:r>
+        <w:t>electric</w:t>
+      </w:r>
+      <w:r>
+        <w:t xml:space="preserve"> markets, which use the BES to transmit electricity, are constructs that allow </w:t>
       </w:r>
       <w:r>
         <w:t>a region</w:t>
@@ -426,7 +432,13 @@
         <w:t>market monitors to spend more time on domain-specific analysis and less time on developing and debugging code</w:t>
       </w:r>
       <w:r>
-        <w:t>. Rather than requiring them to maintain a technical programming skillset, we present a foundation for a domain-specific language (DSL) that allows market monitors to express their analytics in notations better suited to energy data. The language then translates these notations into valid SAS code which can process the energy market data on behalf of the analyst.</w:t>
+        <w:t xml:space="preserve">. </w:t>
+      </w:r>
+      <w:r>
+        <w:t>To these ends</w:t>
+      </w:r>
+      <w:r>
+        <w:t>, we present a foundation for a domain-specific language (DSL) that allows market monitors to express their analytics in notations better suited to energy data. The language then translates these notations into valid SAS code which can process the energy market data on behalf of the analyst.</w:t>
       </w:r>
     </w:p>
     <w:p>
@@ -472,7 +484,19 @@
         <w:t xml:space="preserve">The BES itself is one of the largest, most operationally complex machines. In the organized electricity markets, a Regional Transmission Organization (RTO) or Independent System Operator (ISO) not only manages the physical grid, ensuring the reliable utilization of the thousands of resources, transformers, transmission lines, and other grid components, but also performs long term transmission planning, studies the addition and retirement of generating resources, commits and dispatches generating resources to minimize the cost of electricity, and settles all wholesale market transactions. </w:t>
       </w:r>
       <w:r>
-        <w:t>A natural result of the diverse roles the RTOs and ISOs play across different time horizons lends to a complex data infrastructure that is often fragmented. To effectively and holistically analyze the wholesale electric market, market monitors must routinely interact with data from many of the functional areas of their market.</w:t>
+        <w:t xml:space="preserve">A natural result of the diverse roles the RTOs and ISOs play across different time horizons </w:t>
+      </w:r>
+      <w:r>
+        <w:t xml:space="preserve">is a </w:t>
+      </w:r>
+      <w:r>
+        <w:t xml:space="preserve">complex data infrastructure that is often fragmented. To effectively and holistically analyze the wholesale electric market, market monitors must routinely interact </w:t>
+      </w:r>
+      <w:r>
+        <w:t>and combine data from these data sets, often across different databases and without clear primary keys and documented schemas</w:t>
+      </w:r>
+      <w:r>
+        <w:t>.</w:t>
       </w:r>
     </w:p>
     <w:p>
@@ -570,13 +594,16 @@
         <w:t>tend</w:t>
       </w:r>
       <w:r>
-        <w:t xml:space="preserve"> to leave the institution when the knowledge holder leaves. This also represents risk to a market monitoring authority’s ability to serve its mandate when knowledge is not formalized.</w:t>
-      </w:r>
-    </w:p>
-    <w:p>
-      <w:r>
-        <w:t xml:space="preserve"> </w:t>
-      </w:r>
+        <w:t xml:space="preserve"> to leave the institution when the knowledge holder leaves. This also represents risk to a market monitoring authority’s ability to serve its </w:t>
+      </w:r>
+      <w:r>
+        <w:t>mandate</w:t>
+      </w:r>
+      <w:r>
+        <w:t>.</w:t>
+      </w:r>
+    </w:p>
+    <w:p>
       <w:r>
         <w:t>A DSL can leverage</w:t>
       </w:r>
@@ -3092,6 +3119,9 @@
         <w:instrText xml:space="preserve"> REF _Ref236815979 \h </w:instrText>
       </w:r>
       <w:r>
+        <w:instrText xml:space="preserve"> \* MERGEFORMAT </w:instrText>
+      </w:r>
+      <w:r>
         <w:fldChar w:fldCharType="separate"/>
       </w:r>
       <w:r>
@@ -3104,7 +3134,13 @@
         <w:t xml:space="preserve"> </w:t>
       </w:r>
       <w:r>
-        <w:t>displays the derived requirements.</w:t>
+        <w:t>presents</w:t>
+      </w:r>
+      <w:r>
+        <w:t xml:space="preserve"> the derived requirements</w:t>
+      </w:r>
+      <w:r>
+        <w:t xml:space="preserve">, along with the passing criteria, that is, the criteria that the system should meet to ultimately satisfy the requirements. </w:t>
       </w:r>
     </w:p>
     <w:tbl>
@@ -3536,19 +3572,8 @@
       <w:r>
         <w:t xml:space="preserve"> are intended to display that the </w:t>
       </w:r>
-      <w:proofErr w:type="gramStart"/>
-      <w:r>
-        <w:t>derived requirements</w:t>
-      </w:r>
-      <w:proofErr w:type="gramEnd"/>
-      <w:r>
-        <w:t xml:space="preserve"> are met by the </w:t>
-      </w:r>
-      <w:r>
-        <w:t>proof-of-concept</w:t>
-      </w:r>
-      <w:r>
-        <w:t>:</w:t>
+      <w:r>
+        <w:t>proof-of-concept can support the listed requirements.</w:t>
       </w:r>
     </w:p>
     <w:p>
@@ -3560,7 +3585,10 @@
         </w:numPr>
       </w:pPr>
       <w:r>
-        <w:t>Data loading and exporting</w:t>
+        <w:t xml:space="preserve">Data </w:t>
+      </w:r>
+      <w:r>
+        <w:t>loading</w:t>
       </w:r>
     </w:p>
     <w:p>
@@ -4110,10 +4138,7 @@
         <w:fldChar w:fldCharType="begin"/>
       </w:r>
       <w:r>
-        <w:instrText xml:space="preserve"> REF _Ref239854979 \h </w:instrText>
-      </w:r>
-      <w:r>
-        <w:instrText xml:space="preserve"> \* MERGEFORMAT </w:instrText>
+        <w:instrText xml:space="preserve"> REF _Ref239854979 \h  \* MERGEFORMAT </w:instrText>
       </w:r>
       <w:r>
         <w:fldChar w:fldCharType="separate"/>
@@ -4373,6 +4398,7 @@
         <w:rPr>
           <w:i w:val="0"/>
           <w:iCs w:val="0"/>
+          <w:noProof/>
           <w:color w:val="auto"/>
         </w:rPr>
         <w:t>3</w:t>
@@ -4934,7 +4960,7 @@
         <w:fldChar w:fldCharType="begin"/>
       </w:r>
       <w:r>
-        <w:instrText xml:space="preserve"> REF _Ref239855578 \h </w:instrText>
+        <w:instrText xml:space="preserve"> REF _Ref240035194 \h </w:instrText>
       </w:r>
       <w:r>
         <w:instrText xml:space="preserve"> \* MERGEFORMAT </w:instrText>
@@ -4948,6 +4974,7 @@
       <w:r>
         <w:fldChar w:fldCharType="end"/>
       </w:r>
+      <w:fldSimple w:instr=" REF _Ref239855578 \h  \* MERGEFORMAT "/>
       <w:r>
         <w:t xml:space="preserve"> and </w:t>
       </w:r>
@@ -4955,16 +4982,16 @@
         <w:fldChar w:fldCharType="begin"/>
       </w:r>
       <w:r>
-        <w:instrText xml:space="preserve"> REF _Ref239855583 \h </w:instrText>
-      </w:r>
-      <w:r>
-        <w:instrText xml:space="preserve"> \* MERGEFORMAT </w:instrText>
+        <w:instrText xml:space="preserve"> REF _Ref239855583 \h  \* MERGEFORMAT </w:instrText>
       </w:r>
       <w:r>
         <w:fldChar w:fldCharType="separate"/>
       </w:r>
       <w:r>
-        <w:t>Figure 10</w:t>
+        <w:t xml:space="preserve">Figure </w:t>
+      </w:r>
+      <w:r>
+        <w:t>10</w:t>
       </w:r>
       <w:r>
         <w:fldChar w:fldCharType="end"/>
@@ -5620,13 +5647,21 @@
     </w:p>
     <w:p>
       <w:r>
-        <w:t xml:space="preserve">This paper presents a </w:t>
+        <w:t xml:space="preserve">This paper presents </w:t>
+      </w:r>
+      <w:proofErr w:type="gramStart"/>
+      <w:r>
+        <w:t xml:space="preserve">a </w:t>
       </w:r>
       <w:r>
         <w:t>basic</w:t>
       </w:r>
       <w:r>
-        <w:t xml:space="preserve"> foundation for translating a custom domain-specific language into valid SAS code. SAS is a powerful transpiler target for the “Monitor Language”, due to its built-in data management and reporting ecosystem. Currently, “</w:t>
+        <w:t xml:space="preserve"> foundation</w:t>
+      </w:r>
+      <w:proofErr w:type="gramEnd"/>
+      <w:r>
+        <w:t xml:space="preserve"> for translating a custom domain-specific language into valid SAS code. SAS is a powerful transpiler target for the “Monitor Language”, due to its built-in data management and reporting ecosystem. Currently, “</w:t>
       </w:r>
       <w:proofErr w:type="spellStart"/>
       <w:r>
@@ -6447,7 +6482,10 @@
           <w:b/>
           <w:bCs/>
         </w:rPr>
-        <w:t>Eric Grasby; Daniel Berleant, PhD</w:t>
+        <w:t>Eric Grasby; Daniel Berleant</w:t>
+      </w:r>
+      <w:r>
+        <w:t xml:space="preserve"> </w:t>
       </w:r>
       <w:r>
         <w:br/>
@@ -6471,8 +6509,24 @@
       </w:r>
       <w:proofErr w:type="spellEnd"/>
       <w:r>
-        <w:t>}@ualr.edu</w:t>
-      </w:r>
+        <w:t>}</w:t>
+      </w:r>
+      <w:r>
+        <w:t xml:space="preserve"> (at) </w:t>
+      </w:r>
+      <w:proofErr w:type="spellStart"/>
+      <w:r>
+        <w:t>ualr</w:t>
+      </w:r>
+      <w:proofErr w:type="spellEnd"/>
+      <w:r>
+        <w:t xml:space="preserve"> (dot) </w:t>
+      </w:r>
+      <w:proofErr w:type="spellStart"/>
+      <w:r>
+        <w:t>edu</w:t>
+      </w:r>
+      <w:proofErr w:type="spellEnd"/>
     </w:p>
     <w:p>
       <w:pPr>
@@ -6491,19 +6545,31 @@
           <w:b/>
           <w:bCs/>
         </w:rPr>
-        <w:t>Maria CB Gingras, PhD</w:t>
+        <w:t>Maria CB Gingras</w:t>
       </w:r>
       <w:r>
         <w:br/>
       </w:r>
-      <w:hyperlink r:id="rId31" w:history="1">
-        <w:r>
-          <w:rPr>
-            <w:rStyle w:val="Hyperlink"/>
-          </w:rPr>
-          <w:t>https://www.linkedin.com/in/mariacbrun/</w:t>
-        </w:r>
-      </w:hyperlink>
+      <w:r>
+        <w:t>maria</w:t>
+      </w:r>
+      <w:r>
+        <w:t xml:space="preserve"> </w:t>
+      </w:r>
+      <w:r>
+        <w:t xml:space="preserve">(at) </w:t>
+      </w:r>
+      <w:proofErr w:type="spellStart"/>
+      <w:r>
+        <w:t>ochotonaanalytics</w:t>
+      </w:r>
+      <w:proofErr w:type="spellEnd"/>
+      <w:r>
+        <w:t xml:space="preserve"> (dot) </w:t>
+      </w:r>
+      <w:r>
+        <w:t>com</w:t>
+      </w:r>
     </w:p>
     <w:p>
       <w:pPr>
@@ -6518,7 +6584,7 @@
       <w:bookmarkEnd w:id="24"/>
       <w:bookmarkEnd w:id="25"/>
       <w:r>
-        <w:t>Appendix</w:t>
+        <w:t>APPENDIX</w:t>
       </w:r>
     </w:p>
     <w:p>
@@ -6527,20 +6593,34 @@
       </w:r>
       <w:r>
         <w:t xml:space="preserve"> </w:t>
+      </w:r>
+      <w:hyperlink r:id="rId31" w:history="1">
+        <w:r>
+          <w:rPr>
+            <w:rStyle w:val="Hyperlink"/>
+          </w:rPr>
+          <w:t>https://github.com/echarlesgrasby/seasug-2026-paper/tree/master/transpiler</w:t>
+        </w:r>
+      </w:hyperlink>
+      <w:r>
+        <w:t xml:space="preserve"> </w:t>
+      </w:r>
+      <w:r>
+        <w:t>for any source code referenced in this paper.</w:t>
+      </w:r>
+      <w:r>
+        <w:t xml:space="preserve"> Other material can be found </w:t>
       </w:r>
       <w:hyperlink r:id="rId32" w:history="1">
         <w:r>
           <w:rPr>
             <w:rStyle w:val="Hyperlink"/>
           </w:rPr>
-          <w:t>https://github.com/echarlesgrasby/seasug-2026-paper/tree/master/appendix</w:t>
+          <w:t>here</w:t>
         </w:r>
       </w:hyperlink>
       <w:r>
-        <w:t xml:space="preserve"> </w:t>
-      </w:r>
-      <w:r>
-        <w:t>for any source code referenced in this paper.</w:t>
+        <w:t>.</w:t>
       </w:r>
     </w:p>
     <w:p>
@@ -6611,10 +6691,10 @@
             <v:path o:extrusionok="f" gradientshapeok="t" o:connecttype="rect"/>
             <o:lock v:ext="edit" aspectratio="t"/>
           </v:shapetype>
-          <v:shape id="_x0000_i1025" type="#_x0000_t75" style="width:448.35pt;height:586.3pt" o:ole="">
+          <v:shape id="_x0000_i1028" type="#_x0000_t75" style="width:446.4pt;height:582.9pt" o:ole="">
             <v:imagedata r:id="rId33" o:title=""/>
           </v:shape>
-          <o:OLEObject Type="Embed" ProgID="Word.OpenDocumentText.12" ShapeID="_x0000_i1025" DrawAspect="Content" ObjectID="_1850468911" r:id="rId34"/>
+          <o:OLEObject Type="Embed" ProgID="Word.OpenDocumentText.12" ShapeID="_x0000_i1028" DrawAspect="Content" ObjectID="_1850649236" r:id="rId34"/>
         </w:object>
       </w:r>
     </w:p>
@@ -6622,11 +6702,11 @@
     <w:bookmarkEnd w:id="27"/>
     <w:p>
       <w:r>
-        <w:object w:dxaOrig="9360" w:dyaOrig="9318" w14:anchorId="2F16B835">
-          <v:shape id="_x0000_i1026" type="#_x0000_t75" style="width:468pt;height:466.6pt" o:ole="">
+        <w:object w:dxaOrig="9360" w:dyaOrig="9074" w14:anchorId="2F16B835">
+          <v:shape id="_x0000_i1031" type="#_x0000_t75" style="width:468.3pt;height:456.2pt" o:ole="">
             <v:imagedata r:id="rId35" o:title=""/>
           </v:shape>
-          <o:OLEObject Type="Embed" ProgID="Word.OpenDocumentText.12" ShapeID="_x0000_i1026" DrawAspect="Content" ObjectID="_1850468912" r:id="rId36"/>
+          <o:OLEObject Type="Embed" ProgID="Word.OpenDocumentText.12" ShapeID="_x0000_i1031" DrawAspect="Content" ObjectID="_1850649237" r:id="rId36"/>
         </w:object>
       </w:r>
     </w:p>
@@ -6675,13 +6755,12 @@
       <w:r>
         <w:rPr>
           <w:noProof/>
-          <w:lang w:val="en-US"/>
         </w:rPr>
         <w:drawing>
-          <wp:inline distT="0" distB="0" distL="0" distR="0" wp14:anchorId="403B2EFE" wp14:editId="07C1076C">
-            <wp:extent cx="4276725" cy="3196121"/>
-            <wp:effectExtent l="19050" t="19050" r="9525" b="23495"/>
-            <wp:docPr id="1031051658" name="Picture 6"/>
+          <wp:inline distT="0" distB="0" distL="0" distR="0" wp14:anchorId="3F19C24F" wp14:editId="2F16B3BD">
+            <wp:extent cx="4292600" cy="3213711"/>
+            <wp:effectExtent l="19050" t="19050" r="12700" b="25400"/>
+            <wp:docPr id="51593001" name="Picture 2"/>
             <wp:cNvGraphicFramePr>
               <a:graphicFrameLocks xmlns:a="http://schemas.openxmlformats.org/drawingml/2006/main" noChangeAspect="1"/>
             </wp:cNvGraphicFramePr>
@@ -6689,13 +6768,13 @@
               <a:graphicData uri="http://schemas.openxmlformats.org/drawingml/2006/picture">
                 <pic:pic xmlns:pic="http://schemas.openxmlformats.org/drawingml/2006/picture">
                   <pic:nvPicPr>
-                    <pic:cNvPr id="0" name="Picture 51"/>
+                    <pic:cNvPr id="0" name="Picture 9"/>
                     <pic:cNvPicPr>
                       <a:picLocks noChangeAspect="1" noChangeArrowheads="1"/>
                     </pic:cNvPicPr>
                   </pic:nvPicPr>
                   <pic:blipFill>
-                    <a:blip r:embed="rId37" cstate="print">
+                    <a:blip r:embed="rId37">
                       <a:extLst>
                         <a:ext uri="{28A0092B-C50C-407E-A947-70E740481C1C}">
                           <a14:useLocalDpi xmlns:a14="http://schemas.microsoft.com/office/drawing/2010/main" val="0"/>
@@ -6710,7 +6789,7 @@
                   <pic:spPr bwMode="auto">
                     <a:xfrm>
                       <a:off x="0" y="0"/>
-                      <a:ext cx="4299016" cy="3212780"/>
+                      <a:ext cx="4301945" cy="3220707"/>
                     </a:xfrm>
                     <a:prstGeom prst="rect">
                       <a:avLst/>
@@ -6739,7 +6818,7 @@
           <w:color w:val="auto"/>
         </w:rPr>
       </w:pPr>
-      <w:bookmarkStart w:id="28" w:name="_Ref239855578"/>
+      <w:bookmarkStart w:id="28" w:name="_Ref240035194"/>
       <w:r>
         <w:rPr>
           <w:i w:val="0"/>
@@ -6797,11 +6876,6 @@
         </w:rPr>
         <w:t>. Utility-level HHI as a function of nameplate capacity</w:t>
       </w:r>
-    </w:p>
-    <w:p>
-      <w:pPr>
-        <w:jc w:val="center"/>
-      </w:pPr>
     </w:p>
     <w:p>
       <w:pPr>
@@ -6912,6 +6986,7 @@
         <w:rPr>
           <w:i w:val="0"/>
           <w:iCs w:val="0"/>
+          <w:noProof/>
           <w:color w:val="auto"/>
         </w:rPr>
         <w:t>10</w:t>
@@ -7161,24 +7236,46 @@
       <w:pPr>
         <w:pStyle w:val="FootnoteText"/>
         <w:rPr>
-          <w:lang w:val="en-US"/>
-        </w:rPr>
-      </w:pPr>
-      <w:r>
-        <w:rPr>
-          <w:rStyle w:val="FootnoteReference"/>
-        </w:rPr>
-        <w:footnoteRef/>
-      </w:r>
-      <w:r>
-        <w:t xml:space="preserve"> CFR </w:t>
-      </w:r>
-      <w:r>
-        <w:rPr>
           <w:sz w:val="18"/>
           <w:szCs w:val="18"/>
         </w:rPr>
-        <w:t>18 35.41.</w:t>
+      </w:pPr>
+      <w:r>
+        <w:rPr>
+          <w:rStyle w:val="FootnoteReference"/>
+        </w:rPr>
+        <w:footnoteRef/>
+      </w:r>
+      <w:r>
+        <w:t xml:space="preserve"> </w:t>
+      </w:r>
+      <w:r>
+        <w:rPr>
+          <w:sz w:val="18"/>
+          <w:szCs w:val="18"/>
+        </w:rPr>
+        <w:t>CFR</w:t>
+      </w:r>
+      <w:r>
+        <w:rPr>
+          <w:sz w:val="18"/>
+          <w:szCs w:val="18"/>
+        </w:rPr>
+        <w:t xml:space="preserve"> </w:t>
+      </w:r>
+      <w:r>
+        <w:rPr>
+          <w:sz w:val="18"/>
+          <w:szCs w:val="18"/>
+        </w:rPr>
+        <w:t>18 35.41</w:t>
+      </w:r>
+      <w:r>
+        <w:rPr>
+          <w:sz w:val="18"/>
+          <w:szCs w:val="18"/>
+        </w:rPr>
+        <w:t xml:space="preserve"> </w:t>
       </w:r>
       <w:r>
         <w:rPr>
@@ -10754,6 +10851,7 @@
   <w:style w:type="character" w:default="1" w:styleId="DefaultParagraphFont">
     <w:name w:val="Default Paragraph Font"/>
     <w:uiPriority w:val="1"/>
+    <w:semiHidden/>
     <w:unhideWhenUsed/>
   </w:style>
   <w:style w:type="table" w:default="1" w:styleId="TableNormal">

</xml_diff>